<commit_message>
v3.13 — Uppdatera beskrivning och README med korrekt v3.13-innehåll
Beskrivningsskriptet beskrev v3.11-funktioner istället för v3.13.
README får ny 'Senaste version'-sektion med markdown-beskrivning.
Literal \n i ändringslogg rättad.

Co-Authored-By: Claude Sonnet 4.6 <noreply@anthropic.com>
</commit_message>
<xml_diff>
--- a/Strategiportfoljen_Beskrivning_v313.docx
+++ b/Strategiportfoljen_Beskrivning_v313.docx
@@ -75,7 +75,7 @@
           <w:color w:val="0EA5E9"/>
           <w:sz w:val="24"/>
         </w:rPr>
-        <w:t>Inställningar-sektion och förbättrad Kassa</w:t>
+        <w:t>Avstämning mot Avanza — omarbetad</w:t>
       </w:r>
     </w:p>
     <w:p>
@@ -87,7 +87,63 @@
           <w:color w:val="111827"/>
           <w:sz w:val="21"/>
         </w:rPr>
-        <w:t>Version 3.13 introducerar en komplett administrationsfunktion via en ny ⚙️ Inställningar-sektion och förbättrar Kassa-tabellen med inline-inmatning direkt per rad.</w:t>
+        <w:t>Version 3.13 fokuserar på att göra Avstämning-fliken pålitlig och jämförbar med Avanzas egna översiktsvy. Flera fel som funnits sedan v3.03 är nu rättade.</w:t>
+      </w:r>
+    </w:p>
+    <w:p>
+      <w:pPr>
+        <w:pStyle w:val="ListBullet"/>
+        <w:spacing w:before="20" w:after="40"/>
+        <w:ind w:left="454"/>
+      </w:pPr>
+      <w:r>
+        <w:rPr>
+          <w:color w:val="111827"/>
+          <w:sz w:val="21"/>
+        </w:rPr>
+        <w:t>Ny rubrik 'Avstämning mot Avanza' och framträdande summaryrad med Totalt värde och Tillgängligt för köp — samma layout som Avanza.</w:t>
+      </w:r>
+    </w:p>
+    <w:p>
+      <w:pPr>
+        <w:pStyle w:val="ListBullet"/>
+        <w:spacing w:before="20" w:after="40"/>
+        <w:ind w:left="454"/>
+      </w:pPr>
+      <w:r>
+        <w:rPr>
+          <w:color w:val="111827"/>
+          <w:sz w:val="21"/>
+        </w:rPr>
+        <w:t>Kontots totalt = investerat + tillgängligt för köp, vilket matchar Avanzas visning per konto.</w:t>
+      </w:r>
+    </w:p>
+    <w:p>
+      <w:pPr>
+        <w:pStyle w:val="ListBullet"/>
+        <w:spacing w:before="20" w:after="40"/>
+        <w:ind w:left="454"/>
+      </w:pPr>
+      <w:r>
+        <w:rPr>
+          <w:color w:val="111827"/>
+          <w:sz w:val="21"/>
+        </w:rPr>
+        <w:t>Avanza sparande Martin (SPAR) visas nu med korrekt saldo i Avstämning.</w:t>
+      </w:r>
+    </w:p>
+    <w:p>
+      <w:pPr>
+        <w:pStyle w:val="ListBullet"/>
+        <w:spacing w:before="20" w:after="40"/>
+        <w:ind w:left="454"/>
+      </w:pPr>
+      <w:r>
+        <w:rPr>
+          <w:color w:val="111827"/>
+          <w:sz w:val="21"/>
+        </w:rPr>
+        <w:t>Tillgängligt för köp per konto visade 0 kr trots inmatat värde — rättat.</w:t>
       </w:r>
     </w:p>
     <w:p>
@@ -100,7 +156,7 @@
           <w:color w:val="0EA5E9"/>
           <w:sz w:val="24"/>
         </w:rPr>
-        <w:t>Ny Inställningar-sektion</w:t>
+        <w:t>Buggfix: Eget fondsparande fel kontonr (sedan v3.03)</w:t>
       </w:r>
     </w:p>
     <w:p>
@@ -112,7 +168,7 @@
           <w:color w:val="111827"/>
           <w:sz w:val="21"/>
         </w:rPr>
-        <w:t>Alla konfigurerbara parametrar samlas nu i en dedikerad sektion i navigeringsmenyn. Ingen kodredigering behövs för att anpassa appen.</w:t>
+        <w:t>Kontot 'Eget fondsparande' var felaktigt kopplat till pensionskontot (9552-6014837) i stället för det riktiga ISK-kontot (9557-7346055). Felet medförde att Avanza Zero inte importerades korrekt och att kontovärdena var ~25 000 kr för låga.</w:t>
       </w:r>
     </w:p>
     <w:p>
@@ -126,7 +182,7 @@
           <w:color w:val="111827"/>
           <w:sz w:val="21"/>
         </w:rPr>
-        <w:t>Kontokonfiguration — lägg till, redigera, ta bort och ändra ordning på Avanza-konton via UI.</w:t>
+        <w:t>Rätt kontonr: 9557-7346055 (ISK) — pensionskontot 9552-6014837 exkluderas nu korrekt.</w:t>
       </w:r>
     </w:p>
     <w:p>
@@ -140,63 +196,7 @@
           <w:color w:val="111827"/>
           <w:sz w:val="21"/>
         </w:rPr>
-        <w:t>Kategori-editor — ersätter prompt()-dialoger med visuellt inline-formulär (emoji, färg, vikter, signal).</w:t>
-      </w:r>
-    </w:p>
-    <w:p>
-      <w:pPr>
-        <w:pStyle w:val="ListBullet"/>
-        <w:spacing w:before="20" w:after="40"/>
-        <w:ind w:left="454"/>
-      </w:pPr>
-      <w:r>
-        <w:rPr>
-          <w:color w:val="111827"/>
-          <w:sz w:val="21"/>
-        </w:rPr>
-        <w:t>Strategiparametrar — exponerar MA200-gränser, nödutgångsgräns, ombalansering och koncentrationsrisk.</w:t>
-      </w:r>
-    </w:p>
-    <w:p>
-      <w:pPr>
-        <w:pStyle w:val="ListBullet"/>
-        <w:spacing w:before="20" w:after="40"/>
-        <w:ind w:left="454"/>
-      </w:pPr>
-      <w:r>
-        <w:rPr>
-          <w:color w:val="111827"/>
-          <w:sz w:val="21"/>
-        </w:rPr>
-        <w:t>Profil &amp; information — redigerbara fält för namn och strategi-titel (används i exporter).</w:t>
-      </w:r>
-    </w:p>
-    <w:p>
-      <w:pPr>
-        <w:pStyle w:val="ListBullet"/>
-        <w:spacing w:before="20" w:after="40"/>
-        <w:ind w:left="454"/>
-      </w:pPr>
-      <w:r>
-        <w:rPr>
-          <w:color w:val="111827"/>
-          <w:sz w:val="21"/>
-        </w:rPr>
-        <w:t>Värdepappersfilter — lägg till/ta bort exkluderade värdepapper och konton från import.</w:t>
-      </w:r>
-    </w:p>
-    <w:p>
-      <w:pPr>
-        <w:pStyle w:val="ListBullet"/>
-        <w:spacing w:before="20" w:after="40"/>
-        <w:ind w:left="454"/>
-      </w:pPr>
-      <w:r>
-        <w:rPr>
-          <w:color w:val="111827"/>
-          <w:sz w:val="21"/>
-        </w:rPr>
-        <w:t>Export/import av inställningar — flytta hela strategikonfigurationen mellan enheter som JSON.</w:t>
+        <w:t>Befintlig kontokonfiguration och exkluderingslista migreras automatiskt vid laddning.</w:t>
       </w:r>
     </w:p>
     <w:p>
@@ -209,7 +209,7 @@
           <w:color w:val="0EA5E9"/>
           <w:sz w:val="24"/>
         </w:rPr>
-        <w:t>Kassa — inline-inmatning per rad</w:t>
+        <w:t>Arkitektur: manuell kassa ingår inte i portföljvärdet</w:t>
       </w:r>
     </w:p>
     <w:p>
@@ -221,7 +221,7 @@
           <w:color w:val="111827"/>
           <w:sz w:val="21"/>
         </w:rPr>
-        <w:t>Kassa-tabellen visar nu alltid alla konton (inkl. de utan likvida medel i positionsfilen). Varje rad har ett eget inmatningsfält och Spara-knapp — det separata formuläret är borttaget.</w:t>
+        <w:t>Manuella insättningar och uttag (Kassa-sektionen) räknas inte längre in i portföljvärdet. De används enbart för att beräkna nettoinsatt kapital och avkastning. Eliminerar dubbelräkning när sparkontosaldo redan finns med i Avstämning.</w:t>
       </w:r>
     </w:p>
     <w:p>
@@ -235,7 +235,7 @@
           <w:color w:val="111827"/>
           <w:sz w:val="21"/>
         </w:rPr>
-        <w:t>Sparkontot (Avanza sparande Martin) visas som en separat rad, ej inkluderat i totalt tillgängligt för köp.</w:t>
+        <w:t>beräknaTillgängligLikviditet() = bara Avanza-kassa (tillgängligt för köp från positionsfilen).</w:t>
       </w:r>
     </w:p>
     <w:p>
@@ -249,32 +249,7 @@
           <w:color w:val="111827"/>
           <w:sz w:val="21"/>
         </w:rPr>
-        <w:t>Konton utan positionsfildata visas med ⚠️-ikon tills värde anges manuellt eller importeras.</w:t>
-      </w:r>
-    </w:p>
-    <w:p>
-      <w:pPr>
-        <w:spacing w:before="280" w:after="80"/>
-      </w:pPr>
-      <w:r>
-        <w:rPr>
-          <w:b/>
-          <w:color w:val="0EA5E9"/>
-          <w:sz w:val="24"/>
-        </w:rPr>
-        <w:t>Buggfixar</w:t>
-      </w:r>
-    </w:p>
-    <w:p>
-      <w:pPr>
-        <w:spacing w:before="0" w:after="120"/>
-      </w:pPr>
-      <w:r>
-        <w:rPr>
-          <w:color w:val="111827"/>
-          <w:sz w:val="21"/>
-        </w:rPr>
-        <w:t>Kontonummer för Avanza sparande Martin korrigerat till 0040080455 (visades utan ledande nollor i Avstämning). Kassa-tabellen visade inte konton vars likvida medel saknades i positionsfilen.</w:t>
+        <w:t>Nettoinsatt-kortet på Dashboard visar fortfarande summan av insättningar/uttag för avkastningsberäkning.</w:t>
       </w:r>
     </w:p>
     <w:p>

</xml_diff>